<commit_message>
adding links to word doc
</commit_message>
<xml_diff>
--- a/Fase 2 - Fundamentos de Sistemas Web.docx
+++ b/Fase 2 - Fundamentos de Sistemas Web.docx
@@ -1,6 +1,6 @@
 
 <file path=word/document.xml><?xml version="1.0" encoding="utf-8"?>
-<w:document xmlns:wpc="http://schemas.microsoft.com/office/word/2010/wordprocessingCanvas" xmlns:cx="http://schemas.microsoft.com/office/drawing/2014/chartex" xmlns:cx1="http://schemas.microsoft.com/office/drawing/2015/9/8/chartex" xmlns:cx2="http://schemas.microsoft.com/office/drawing/2015/10/21/chartex" xmlns:cx3="http://schemas.microsoft.com/office/drawing/2016/5/9/chartex" xmlns:cx4="http://schemas.microsoft.com/office/drawing/2016/5/10/chartex" xmlns:cx5="http://schemas.microsoft.com/office/drawing/2016/5/11/chartex" xmlns:cx6="http://schemas.microsoft.com/office/drawing/2016/5/12/chartex" xmlns:cx7="http://schemas.microsoft.com/office/drawing/2016/5/13/chartex" xmlns:cx8="http://schemas.microsoft.com/office/drawing/2016/5/14/chartex" xmlns:mc="http://schemas.openxmlformats.org/markup-compatibility/2006" xmlns:aink="http://schemas.microsoft.com/office/drawing/2016/ink" xmlns:am3d="http://schemas.microsoft.com/office/drawing/2017/model3d" xmlns:o="urn:schemas-microsoft-com:office:office" xmlns:r="http://schemas.openxmlformats.org/officeDocument/2006/relationships" xmlns:m="http://schemas.openxmlformats.org/officeDocument/2006/math" xmlns:v="urn:schemas-microsoft-com:vml" xmlns:wp14="http://schemas.microsoft.com/office/word/2010/wordprocessingDrawing" xmlns:wp="http://schemas.openxmlformats.org/drawingml/2006/wordprocessingDrawing" xmlns:w10="urn:schemas-microsoft-com:office:word" xmlns:w="http://schemas.openxmlformats.org/wordprocessingml/2006/main" xmlns:w14="http://schemas.microsoft.com/office/word/2010/wordml" xmlns:w15="http://schemas.microsoft.com/office/word/2012/wordml" xmlns:w16cid="http://schemas.microsoft.com/office/word/2016/wordml/cid" xmlns:w16se="http://schemas.microsoft.com/office/word/2015/wordml/symex" xmlns:wpg="http://schemas.microsoft.com/office/word/2010/wordprocessingGroup" xmlns:wpi="http://schemas.microsoft.com/office/word/2010/wordprocessingInk" xmlns:wne="http://schemas.microsoft.com/office/word/2006/wordml" xmlns:wps="http://schemas.microsoft.com/office/word/2010/wordprocessingShape" mc:Ignorable="w14 w15 w16se w16cid wp14">
+<w:document xmlns:wpc="http://schemas.microsoft.com/office/word/2010/wordprocessingCanvas" xmlns:cx="http://schemas.microsoft.com/office/drawing/2014/chartex" xmlns:cx1="http://schemas.microsoft.com/office/drawing/2015/9/8/chartex" xmlns:cx2="http://schemas.microsoft.com/office/drawing/2015/10/21/chartex" xmlns:cx3="http://schemas.microsoft.com/office/drawing/2016/5/9/chartex" xmlns:cx4="http://schemas.microsoft.com/office/drawing/2016/5/10/chartex" xmlns:cx5="http://schemas.microsoft.com/office/drawing/2016/5/11/chartex" xmlns:cx6="http://schemas.microsoft.com/office/drawing/2016/5/12/chartex" xmlns:cx7="http://schemas.microsoft.com/office/drawing/2016/5/13/chartex" xmlns:cx8="http://schemas.microsoft.com/office/drawing/2016/5/14/chartex" xmlns:mc="http://schemas.openxmlformats.org/markup-compatibility/2006" xmlns:aink="http://schemas.microsoft.com/office/drawing/2016/ink" xmlns:am3d="http://schemas.microsoft.com/office/drawing/2017/model3d" xmlns:o="urn:schemas-microsoft-com:office:office" xmlns:oel="http://schemas.microsoft.com/office/2019/extlst" xmlns:r="http://schemas.openxmlformats.org/officeDocument/2006/relationships" xmlns:m="http://schemas.openxmlformats.org/officeDocument/2006/math" xmlns:v="urn:schemas-microsoft-com:vml" xmlns:wp14="http://schemas.microsoft.com/office/word/2010/wordprocessingDrawing" xmlns:wp="http://schemas.openxmlformats.org/drawingml/2006/wordprocessingDrawing" xmlns:w10="urn:schemas-microsoft-com:office:word" xmlns:w="http://schemas.openxmlformats.org/wordprocessingml/2006/main" xmlns:w14="http://schemas.microsoft.com/office/word/2010/wordml" xmlns:w15="http://schemas.microsoft.com/office/word/2012/wordml" xmlns:w16cex="http://schemas.microsoft.com/office/word/2018/wordml/cex" xmlns:w16cid="http://schemas.microsoft.com/office/word/2016/wordml/cid" xmlns:w16="http://schemas.microsoft.com/office/word/2018/wordml" xmlns:w16du="http://schemas.microsoft.com/office/word/2023/wordml/word16du" xmlns:w16sdtdh="http://schemas.microsoft.com/office/word/2020/wordml/sdtdatahash" xmlns:w16sdtfl="http://schemas.microsoft.com/office/word/2024/wordml/sdtformatlock" xmlns:w16se="http://schemas.microsoft.com/office/word/2015/wordml/symex" xmlns:wpg="http://schemas.microsoft.com/office/word/2010/wordprocessingGroup" xmlns:wpi="http://schemas.microsoft.com/office/word/2010/wordprocessingInk" xmlns:wne="http://schemas.microsoft.com/office/word/2006/wordml" xmlns:wps="http://schemas.microsoft.com/office/word/2010/wordprocessingShape" mc:Ignorable="w14 w15 w16se w16cid w16 w16cex w16sdtdh w16sdtfl w16du wp14">
   <w:body>
     <w:p>
       <w:pPr>
@@ -30,18 +30,7 @@
           <w:bCs/>
           <w:color w:val="000000" w:themeColor="text1"/>
         </w:rPr>
-        <w:t>PARA ENTREGA</w:t>
-      </w:r>
-      <w:bookmarkStart w:id="0" w:name="_GoBack"/>
-      <w:bookmarkEnd w:id="0"/>
-      <w:r>
-        <w:rPr>
-          <w:rFonts w:asciiTheme="minorHAnsi" w:eastAsia="Calibri" w:hAnsiTheme="minorHAnsi" w:cstheme="minorHAnsi"/>
-          <w:b/>
-          <w:bCs/>
-          <w:color w:val="000000" w:themeColor="text1"/>
-        </w:rPr>
-        <w:t xml:space="preserve"> DO PROJETO DA DISCIPLINA</w:t>
+        <w:t>PARA ENTREGA DO PROJETO DA DISCIPLINA</w:t>
       </w:r>
       <w:r>
         <w:rPr>
@@ -140,7 +129,7 @@
           <w:b/>
           <w:color w:val="FFFFFF" w:themeColor="background1"/>
         </w:rPr>
-        <w:t xml:space="preserve">: </w:t>
+        <w:t>:</w:t>
       </w:r>
       <w:r>
         <w:rPr>
@@ -149,7 +138,7 @@
           <w:b/>
           <w:color w:val="FFFFFF" w:themeColor="background1"/>
         </w:rPr>
-        <w:t xml:space="preserve">Insira aqui seu nome  </w:t>
+        <w:t xml:space="preserve"> Felix Pinheiro Lee</w:t>
       </w:r>
     </w:p>
     <w:p>
@@ -179,11 +168,8 @@
         <w:spacing w:after="0" w:line="240" w:lineRule="auto"/>
         <w:jc w:val="both"/>
         <w:rPr>
-          <w:rFonts w:asciiTheme="minorHAnsi" w:hAnsiTheme="minorHAnsi" w:cstheme="minorHAnsi"/>
-          <w:b/>
-          <w:bCs/>
-          <w:color w:val="4664BE"/>
-          <w:szCs w:val="21"/>
+          <w:rFonts w:asciiTheme="minorHAnsi" w:hAnsiTheme="minorHAnsi"/>
+          <w:color w:val="000000" w:themeColor="text1"/>
         </w:rPr>
       </w:pPr>
       <w:r>
@@ -203,6 +189,29 @@
     </w:p>
     <w:p>
       <w:pPr>
+        <w:spacing w:after="0" w:line="240" w:lineRule="auto"/>
+        <w:jc w:val="both"/>
+        <w:rPr>
+          <w:rFonts w:asciiTheme="minorHAnsi" w:hAnsiTheme="minorHAnsi" w:cstheme="minorHAnsi"/>
+          <w:b/>
+          <w:bCs/>
+          <w:color w:val="4664BE"/>
+          <w:szCs w:val="21"/>
+        </w:rPr>
+      </w:pPr>
+      <w:r>
+        <w:rPr>
+          <w:rFonts w:asciiTheme="minorHAnsi" w:hAnsiTheme="minorHAnsi" w:cstheme="minorHAnsi"/>
+          <w:b/>
+          <w:bCs/>
+          <w:color w:val="4664BE"/>
+          <w:szCs w:val="21"/>
+        </w:rPr>
+        <w:t>https://github.com/FelixPLee/Petshop2-entrega2</w:t>
+      </w:r>
+    </w:p>
+    <w:p>
+      <w:pPr>
         <w:spacing w:before="720" w:after="60" w:line="240" w:lineRule="auto"/>
         <w:jc w:val="both"/>
         <w:rPr>
@@ -228,11 +237,8 @@
         <w:spacing w:after="0" w:line="240" w:lineRule="auto"/>
         <w:jc w:val="both"/>
         <w:rPr>
-          <w:rFonts w:asciiTheme="minorHAnsi" w:hAnsiTheme="minorHAnsi" w:cstheme="minorHAnsi"/>
-          <w:b/>
-          <w:bCs/>
-          <w:color w:val="4664BE"/>
-          <w:szCs w:val="21"/>
+          <w:rFonts w:asciiTheme="minorHAnsi" w:hAnsiTheme="minorHAnsi"/>
+          <w:color w:val="000000" w:themeColor="text1"/>
         </w:rPr>
       </w:pPr>
       <w:r>
@@ -250,6 +256,29 @@
         <w:t>aqui o link.</w:t>
       </w:r>
     </w:p>
+    <w:p>
+      <w:pPr>
+        <w:spacing w:after="0" w:line="240" w:lineRule="auto"/>
+        <w:jc w:val="both"/>
+        <w:rPr>
+          <w:rFonts w:asciiTheme="minorHAnsi" w:hAnsiTheme="minorHAnsi" w:cstheme="minorHAnsi"/>
+          <w:b/>
+          <w:bCs/>
+          <w:color w:val="4664BE"/>
+          <w:szCs w:val="21"/>
+        </w:rPr>
+      </w:pPr>
+      <w:r>
+        <w:rPr>
+          <w:rFonts w:asciiTheme="minorHAnsi" w:hAnsiTheme="minorHAnsi" w:cstheme="minorHAnsi"/>
+          <w:b/>
+          <w:bCs/>
+          <w:color w:val="4664BE"/>
+          <w:szCs w:val="21"/>
+        </w:rPr>
+        <w:t>http://felixplee.github.io/Petshop2-entrega2/</w:t>
+      </w:r>
+    </w:p>
     <w:sectPr>
       <w:headerReference w:type="default" r:id="rId11"/>
       <w:footerReference w:type="default" r:id="rId12"/>
@@ -263,7 +292,7 @@
 </file>
 
 <file path=word/endnotes.xml><?xml version="1.0" encoding="utf-8"?>
-<w:endnotes xmlns:wpc="http://schemas.microsoft.com/office/word/2010/wordprocessingCanvas" xmlns:cx="http://schemas.microsoft.com/office/drawing/2014/chartex" xmlns:cx1="http://schemas.microsoft.com/office/drawing/2015/9/8/chartex" xmlns:cx2="http://schemas.microsoft.com/office/drawing/2015/10/21/chartex" xmlns:cx3="http://schemas.microsoft.com/office/drawing/2016/5/9/chartex" xmlns:cx4="http://schemas.microsoft.com/office/drawing/2016/5/10/chartex" xmlns:cx5="http://schemas.microsoft.com/office/drawing/2016/5/11/chartex" xmlns:cx6="http://schemas.microsoft.com/office/drawing/2016/5/12/chartex" xmlns:cx7="http://schemas.microsoft.com/office/drawing/2016/5/13/chartex" xmlns:cx8="http://schemas.microsoft.com/office/drawing/2016/5/14/chartex" xmlns:mc="http://schemas.openxmlformats.org/markup-compatibility/2006" xmlns:aink="http://schemas.microsoft.com/office/drawing/2016/ink" xmlns:am3d="http://schemas.microsoft.com/office/drawing/2017/model3d" xmlns:o="urn:schemas-microsoft-com:office:office" xmlns:r="http://schemas.openxmlformats.org/officeDocument/2006/relationships" xmlns:m="http://schemas.openxmlformats.org/officeDocument/2006/math" xmlns:v="urn:schemas-microsoft-com:vml" xmlns:wp14="http://schemas.microsoft.com/office/word/2010/wordprocessingDrawing" xmlns:wp="http://schemas.openxmlformats.org/drawingml/2006/wordprocessingDrawing" xmlns:w10="urn:schemas-microsoft-com:office:word" xmlns:w="http://schemas.openxmlformats.org/wordprocessingml/2006/main" xmlns:w14="http://schemas.microsoft.com/office/word/2010/wordml" xmlns:w15="http://schemas.microsoft.com/office/word/2012/wordml" xmlns:w16cid="http://schemas.microsoft.com/office/word/2016/wordml/cid" xmlns:w16se="http://schemas.microsoft.com/office/word/2015/wordml/symex" xmlns:wpg="http://schemas.microsoft.com/office/word/2010/wordprocessingGroup" xmlns:wpi="http://schemas.microsoft.com/office/word/2010/wordprocessingInk" xmlns:wne="http://schemas.microsoft.com/office/word/2006/wordml" xmlns:wps="http://schemas.microsoft.com/office/word/2010/wordprocessingShape" mc:Ignorable="w14 w15 w16se w16cid wp14">
+<w:endnotes xmlns:wpc="http://schemas.microsoft.com/office/word/2010/wordprocessingCanvas" xmlns:cx="http://schemas.microsoft.com/office/drawing/2014/chartex" xmlns:cx1="http://schemas.microsoft.com/office/drawing/2015/9/8/chartex" xmlns:cx2="http://schemas.microsoft.com/office/drawing/2015/10/21/chartex" xmlns:cx3="http://schemas.microsoft.com/office/drawing/2016/5/9/chartex" xmlns:cx4="http://schemas.microsoft.com/office/drawing/2016/5/10/chartex" xmlns:cx5="http://schemas.microsoft.com/office/drawing/2016/5/11/chartex" xmlns:cx6="http://schemas.microsoft.com/office/drawing/2016/5/12/chartex" xmlns:cx7="http://schemas.microsoft.com/office/drawing/2016/5/13/chartex" xmlns:cx8="http://schemas.microsoft.com/office/drawing/2016/5/14/chartex" xmlns:mc="http://schemas.openxmlformats.org/markup-compatibility/2006" xmlns:aink="http://schemas.microsoft.com/office/drawing/2016/ink" xmlns:am3d="http://schemas.microsoft.com/office/drawing/2017/model3d" xmlns:o="urn:schemas-microsoft-com:office:office" xmlns:oel="http://schemas.microsoft.com/office/2019/extlst" xmlns:r="http://schemas.openxmlformats.org/officeDocument/2006/relationships" xmlns:m="http://schemas.openxmlformats.org/officeDocument/2006/math" xmlns:v="urn:schemas-microsoft-com:vml" xmlns:wp14="http://schemas.microsoft.com/office/word/2010/wordprocessingDrawing" xmlns:wp="http://schemas.openxmlformats.org/drawingml/2006/wordprocessingDrawing" xmlns:w10="urn:schemas-microsoft-com:office:word" xmlns:w="http://schemas.openxmlformats.org/wordprocessingml/2006/main" xmlns:w14="http://schemas.microsoft.com/office/word/2010/wordml" xmlns:w15="http://schemas.microsoft.com/office/word/2012/wordml" xmlns:w16cex="http://schemas.microsoft.com/office/word/2018/wordml/cex" xmlns:w16cid="http://schemas.microsoft.com/office/word/2016/wordml/cid" xmlns:w16="http://schemas.microsoft.com/office/word/2018/wordml" xmlns:w16du="http://schemas.microsoft.com/office/word/2023/wordml/word16du" xmlns:w16sdtdh="http://schemas.microsoft.com/office/word/2020/wordml/sdtdatahash" xmlns:w16sdtfl="http://schemas.microsoft.com/office/word/2024/wordml/sdtformatlock" xmlns:w16se="http://schemas.microsoft.com/office/word/2015/wordml/symex" xmlns:wpg="http://schemas.microsoft.com/office/word/2010/wordprocessingGroup" xmlns:wpi="http://schemas.microsoft.com/office/word/2010/wordprocessingInk" xmlns:wne="http://schemas.microsoft.com/office/word/2006/wordml" xmlns:wps="http://schemas.microsoft.com/office/word/2010/wordprocessingShape" mc:Ignorable="w14 w15 w16se w16cid w16 w16cex w16sdtdh w16sdtfl w16du wp14">
   <w:endnote w:type="separator" w:id="-1">
     <w:p>
       <w:pPr>
@@ -288,7 +317,7 @@
 </file>
 
 <file path=word/footer1.xml><?xml version="1.0" encoding="utf-8"?>
-<w:ftr xmlns:wpc="http://schemas.microsoft.com/office/word/2010/wordprocessingCanvas" xmlns:cx="http://schemas.microsoft.com/office/drawing/2014/chartex" xmlns:cx1="http://schemas.microsoft.com/office/drawing/2015/9/8/chartex" xmlns:cx2="http://schemas.microsoft.com/office/drawing/2015/10/21/chartex" xmlns:cx3="http://schemas.microsoft.com/office/drawing/2016/5/9/chartex" xmlns:cx4="http://schemas.microsoft.com/office/drawing/2016/5/10/chartex" xmlns:cx5="http://schemas.microsoft.com/office/drawing/2016/5/11/chartex" xmlns:cx6="http://schemas.microsoft.com/office/drawing/2016/5/12/chartex" xmlns:cx7="http://schemas.microsoft.com/office/drawing/2016/5/13/chartex" xmlns:cx8="http://schemas.microsoft.com/office/drawing/2016/5/14/chartex" xmlns:mc="http://schemas.openxmlformats.org/markup-compatibility/2006" xmlns:aink="http://schemas.microsoft.com/office/drawing/2016/ink" xmlns:am3d="http://schemas.microsoft.com/office/drawing/2017/model3d" xmlns:o="urn:schemas-microsoft-com:office:office" xmlns:r="http://schemas.openxmlformats.org/officeDocument/2006/relationships" xmlns:m="http://schemas.openxmlformats.org/officeDocument/2006/math" xmlns:v="urn:schemas-microsoft-com:vml" xmlns:wp14="http://schemas.microsoft.com/office/word/2010/wordprocessingDrawing" xmlns:wp="http://schemas.openxmlformats.org/drawingml/2006/wordprocessingDrawing" xmlns:w10="urn:schemas-microsoft-com:office:word" xmlns:w="http://schemas.openxmlformats.org/wordprocessingml/2006/main" xmlns:w14="http://schemas.microsoft.com/office/word/2010/wordml" xmlns:w15="http://schemas.microsoft.com/office/word/2012/wordml" xmlns:w16cid="http://schemas.microsoft.com/office/word/2016/wordml/cid" xmlns:w16se="http://schemas.microsoft.com/office/word/2015/wordml/symex" xmlns:wpg="http://schemas.microsoft.com/office/word/2010/wordprocessingGroup" xmlns:wpi="http://schemas.microsoft.com/office/word/2010/wordprocessingInk" xmlns:wne="http://schemas.microsoft.com/office/word/2006/wordml" xmlns:wps="http://schemas.microsoft.com/office/word/2010/wordprocessingShape" mc:Ignorable="w14 w15 w16se w16cid wp14">
+<w:ftr xmlns:wpc="http://schemas.microsoft.com/office/word/2010/wordprocessingCanvas" xmlns:cx="http://schemas.microsoft.com/office/drawing/2014/chartex" xmlns:cx1="http://schemas.microsoft.com/office/drawing/2015/9/8/chartex" xmlns:cx2="http://schemas.microsoft.com/office/drawing/2015/10/21/chartex" xmlns:cx3="http://schemas.microsoft.com/office/drawing/2016/5/9/chartex" xmlns:cx4="http://schemas.microsoft.com/office/drawing/2016/5/10/chartex" xmlns:cx5="http://schemas.microsoft.com/office/drawing/2016/5/11/chartex" xmlns:cx6="http://schemas.microsoft.com/office/drawing/2016/5/12/chartex" xmlns:cx7="http://schemas.microsoft.com/office/drawing/2016/5/13/chartex" xmlns:cx8="http://schemas.microsoft.com/office/drawing/2016/5/14/chartex" xmlns:mc="http://schemas.openxmlformats.org/markup-compatibility/2006" xmlns:aink="http://schemas.microsoft.com/office/drawing/2016/ink" xmlns:am3d="http://schemas.microsoft.com/office/drawing/2017/model3d" xmlns:o="urn:schemas-microsoft-com:office:office" xmlns:oel="http://schemas.microsoft.com/office/2019/extlst" xmlns:r="http://schemas.openxmlformats.org/officeDocument/2006/relationships" xmlns:m="http://schemas.openxmlformats.org/officeDocument/2006/math" xmlns:v="urn:schemas-microsoft-com:vml" xmlns:wp14="http://schemas.microsoft.com/office/word/2010/wordprocessingDrawing" xmlns:wp="http://schemas.openxmlformats.org/drawingml/2006/wordprocessingDrawing" xmlns:w10="urn:schemas-microsoft-com:office:word" xmlns:w="http://schemas.openxmlformats.org/wordprocessingml/2006/main" xmlns:w14="http://schemas.microsoft.com/office/word/2010/wordml" xmlns:w15="http://schemas.microsoft.com/office/word/2012/wordml" xmlns:w16cex="http://schemas.microsoft.com/office/word/2018/wordml/cex" xmlns:w16cid="http://schemas.microsoft.com/office/word/2016/wordml/cid" xmlns:w16="http://schemas.microsoft.com/office/word/2018/wordml" xmlns:w16du="http://schemas.microsoft.com/office/word/2023/wordml/word16du" xmlns:w16sdtdh="http://schemas.microsoft.com/office/word/2020/wordml/sdtdatahash" xmlns:w16sdtfl="http://schemas.microsoft.com/office/word/2024/wordml/sdtformatlock" xmlns:w16se="http://schemas.microsoft.com/office/word/2015/wordml/symex" xmlns:wpg="http://schemas.microsoft.com/office/word/2010/wordprocessingGroup" xmlns:wpi="http://schemas.microsoft.com/office/word/2010/wordprocessingInk" xmlns:wne="http://schemas.microsoft.com/office/word/2006/wordml" xmlns:wps="http://schemas.microsoft.com/office/word/2010/wordprocessingShape" mc:Ignorable="w14 w15 w16se w16cid w16 w16cex w16sdtdh w16sdtfl w16du wp14">
   <w:p>
     <w:pPr>
       <w:pStyle w:val="Rodap"/>
@@ -409,7 +438,7 @@
 </file>
 
 <file path=word/footnotes.xml><?xml version="1.0" encoding="utf-8"?>
-<w:footnotes xmlns:wpc="http://schemas.microsoft.com/office/word/2010/wordprocessingCanvas" xmlns:cx="http://schemas.microsoft.com/office/drawing/2014/chartex" xmlns:cx1="http://schemas.microsoft.com/office/drawing/2015/9/8/chartex" xmlns:cx2="http://schemas.microsoft.com/office/drawing/2015/10/21/chartex" xmlns:cx3="http://schemas.microsoft.com/office/drawing/2016/5/9/chartex" xmlns:cx4="http://schemas.microsoft.com/office/drawing/2016/5/10/chartex" xmlns:cx5="http://schemas.microsoft.com/office/drawing/2016/5/11/chartex" xmlns:cx6="http://schemas.microsoft.com/office/drawing/2016/5/12/chartex" xmlns:cx7="http://schemas.microsoft.com/office/drawing/2016/5/13/chartex" xmlns:cx8="http://schemas.microsoft.com/office/drawing/2016/5/14/chartex" xmlns:mc="http://schemas.openxmlformats.org/markup-compatibility/2006" xmlns:aink="http://schemas.microsoft.com/office/drawing/2016/ink" xmlns:am3d="http://schemas.microsoft.com/office/drawing/2017/model3d" xmlns:o="urn:schemas-microsoft-com:office:office" xmlns:r="http://schemas.openxmlformats.org/officeDocument/2006/relationships" xmlns:m="http://schemas.openxmlformats.org/officeDocument/2006/math" xmlns:v="urn:schemas-microsoft-com:vml" xmlns:wp14="http://schemas.microsoft.com/office/word/2010/wordprocessingDrawing" xmlns:wp="http://schemas.openxmlformats.org/drawingml/2006/wordprocessingDrawing" xmlns:w10="urn:schemas-microsoft-com:office:word" xmlns:w="http://schemas.openxmlformats.org/wordprocessingml/2006/main" xmlns:w14="http://schemas.microsoft.com/office/word/2010/wordml" xmlns:w15="http://schemas.microsoft.com/office/word/2012/wordml" xmlns:w16cid="http://schemas.microsoft.com/office/word/2016/wordml/cid" xmlns:w16se="http://schemas.microsoft.com/office/word/2015/wordml/symex" xmlns:wpg="http://schemas.microsoft.com/office/word/2010/wordprocessingGroup" xmlns:wpi="http://schemas.microsoft.com/office/word/2010/wordprocessingInk" xmlns:wne="http://schemas.microsoft.com/office/word/2006/wordml" xmlns:wps="http://schemas.microsoft.com/office/word/2010/wordprocessingShape" mc:Ignorable="w14 w15 w16se w16cid wp14">
+<w:footnotes xmlns:wpc="http://schemas.microsoft.com/office/word/2010/wordprocessingCanvas" xmlns:cx="http://schemas.microsoft.com/office/drawing/2014/chartex" xmlns:cx1="http://schemas.microsoft.com/office/drawing/2015/9/8/chartex" xmlns:cx2="http://schemas.microsoft.com/office/drawing/2015/10/21/chartex" xmlns:cx3="http://schemas.microsoft.com/office/drawing/2016/5/9/chartex" xmlns:cx4="http://schemas.microsoft.com/office/drawing/2016/5/10/chartex" xmlns:cx5="http://schemas.microsoft.com/office/drawing/2016/5/11/chartex" xmlns:cx6="http://schemas.microsoft.com/office/drawing/2016/5/12/chartex" xmlns:cx7="http://schemas.microsoft.com/office/drawing/2016/5/13/chartex" xmlns:cx8="http://schemas.microsoft.com/office/drawing/2016/5/14/chartex" xmlns:mc="http://schemas.openxmlformats.org/markup-compatibility/2006" xmlns:aink="http://schemas.microsoft.com/office/drawing/2016/ink" xmlns:am3d="http://schemas.microsoft.com/office/drawing/2017/model3d" xmlns:o="urn:schemas-microsoft-com:office:office" xmlns:oel="http://schemas.microsoft.com/office/2019/extlst" xmlns:r="http://schemas.openxmlformats.org/officeDocument/2006/relationships" xmlns:m="http://schemas.openxmlformats.org/officeDocument/2006/math" xmlns:v="urn:schemas-microsoft-com:vml" xmlns:wp14="http://schemas.microsoft.com/office/word/2010/wordprocessingDrawing" xmlns:wp="http://schemas.openxmlformats.org/drawingml/2006/wordprocessingDrawing" xmlns:w10="urn:schemas-microsoft-com:office:word" xmlns:w="http://schemas.openxmlformats.org/wordprocessingml/2006/main" xmlns:w14="http://schemas.microsoft.com/office/word/2010/wordml" xmlns:w15="http://schemas.microsoft.com/office/word/2012/wordml" xmlns:w16cex="http://schemas.microsoft.com/office/word/2018/wordml/cex" xmlns:w16cid="http://schemas.microsoft.com/office/word/2016/wordml/cid" xmlns:w16="http://schemas.microsoft.com/office/word/2018/wordml" xmlns:w16du="http://schemas.microsoft.com/office/word/2023/wordml/word16du" xmlns:w16sdtdh="http://schemas.microsoft.com/office/word/2020/wordml/sdtdatahash" xmlns:w16sdtfl="http://schemas.microsoft.com/office/word/2024/wordml/sdtformatlock" xmlns:w16se="http://schemas.microsoft.com/office/word/2015/wordml/symex" xmlns:wpg="http://schemas.microsoft.com/office/word/2010/wordprocessingGroup" xmlns:wpi="http://schemas.microsoft.com/office/word/2010/wordprocessingInk" xmlns:wne="http://schemas.microsoft.com/office/word/2006/wordml" xmlns:wps="http://schemas.microsoft.com/office/word/2010/wordprocessingShape" mc:Ignorable="w14 w15 w16se w16cid w16 w16cex w16sdtdh w16sdtfl w16du wp14">
   <w:footnote w:type="separator" w:id="-1">
     <w:p>
       <w:pPr>
@@ -434,7 +463,7 @@
 </file>
 
 <file path=word/header1.xml><?xml version="1.0" encoding="utf-8"?>
-<w:hdr xmlns:wpc="http://schemas.microsoft.com/office/word/2010/wordprocessingCanvas" xmlns:cx="http://schemas.microsoft.com/office/drawing/2014/chartex" xmlns:cx1="http://schemas.microsoft.com/office/drawing/2015/9/8/chartex" xmlns:cx2="http://schemas.microsoft.com/office/drawing/2015/10/21/chartex" xmlns:cx3="http://schemas.microsoft.com/office/drawing/2016/5/9/chartex" xmlns:cx4="http://schemas.microsoft.com/office/drawing/2016/5/10/chartex" xmlns:cx5="http://schemas.microsoft.com/office/drawing/2016/5/11/chartex" xmlns:cx6="http://schemas.microsoft.com/office/drawing/2016/5/12/chartex" xmlns:cx7="http://schemas.microsoft.com/office/drawing/2016/5/13/chartex" xmlns:cx8="http://schemas.microsoft.com/office/drawing/2016/5/14/chartex" xmlns:mc="http://schemas.openxmlformats.org/markup-compatibility/2006" xmlns:aink="http://schemas.microsoft.com/office/drawing/2016/ink" xmlns:am3d="http://schemas.microsoft.com/office/drawing/2017/model3d" xmlns:o="urn:schemas-microsoft-com:office:office" xmlns:r="http://schemas.openxmlformats.org/officeDocument/2006/relationships" xmlns:m="http://schemas.openxmlformats.org/officeDocument/2006/math" xmlns:v="urn:schemas-microsoft-com:vml" xmlns:wp14="http://schemas.microsoft.com/office/word/2010/wordprocessingDrawing" xmlns:wp="http://schemas.openxmlformats.org/drawingml/2006/wordprocessingDrawing" xmlns:w10="urn:schemas-microsoft-com:office:word" xmlns:w="http://schemas.openxmlformats.org/wordprocessingml/2006/main" xmlns:w14="http://schemas.microsoft.com/office/word/2010/wordml" xmlns:w15="http://schemas.microsoft.com/office/word/2012/wordml" xmlns:w16cid="http://schemas.microsoft.com/office/word/2016/wordml/cid" xmlns:w16se="http://schemas.microsoft.com/office/word/2015/wordml/symex" xmlns:wpg="http://schemas.microsoft.com/office/word/2010/wordprocessingGroup" xmlns:wpi="http://schemas.microsoft.com/office/word/2010/wordprocessingInk" xmlns:wne="http://schemas.microsoft.com/office/word/2006/wordml" xmlns:wps="http://schemas.microsoft.com/office/word/2010/wordprocessingShape" mc:Ignorable="w14 w15 w16se w16cid wp14">
+<w:hdr xmlns:wpc="http://schemas.microsoft.com/office/word/2010/wordprocessingCanvas" xmlns:cx="http://schemas.microsoft.com/office/drawing/2014/chartex" xmlns:cx1="http://schemas.microsoft.com/office/drawing/2015/9/8/chartex" xmlns:cx2="http://schemas.microsoft.com/office/drawing/2015/10/21/chartex" xmlns:cx3="http://schemas.microsoft.com/office/drawing/2016/5/9/chartex" xmlns:cx4="http://schemas.microsoft.com/office/drawing/2016/5/10/chartex" xmlns:cx5="http://schemas.microsoft.com/office/drawing/2016/5/11/chartex" xmlns:cx6="http://schemas.microsoft.com/office/drawing/2016/5/12/chartex" xmlns:cx7="http://schemas.microsoft.com/office/drawing/2016/5/13/chartex" xmlns:cx8="http://schemas.microsoft.com/office/drawing/2016/5/14/chartex" xmlns:mc="http://schemas.openxmlformats.org/markup-compatibility/2006" xmlns:aink="http://schemas.microsoft.com/office/drawing/2016/ink" xmlns:am3d="http://schemas.microsoft.com/office/drawing/2017/model3d" xmlns:o="urn:schemas-microsoft-com:office:office" xmlns:oel="http://schemas.microsoft.com/office/2019/extlst" xmlns:r="http://schemas.openxmlformats.org/officeDocument/2006/relationships" xmlns:m="http://schemas.openxmlformats.org/officeDocument/2006/math" xmlns:v="urn:schemas-microsoft-com:vml" xmlns:wp14="http://schemas.microsoft.com/office/word/2010/wordprocessingDrawing" xmlns:wp="http://schemas.openxmlformats.org/drawingml/2006/wordprocessingDrawing" xmlns:w10="urn:schemas-microsoft-com:office:word" xmlns:w="http://schemas.openxmlformats.org/wordprocessingml/2006/main" xmlns:w14="http://schemas.microsoft.com/office/word/2010/wordml" xmlns:w15="http://schemas.microsoft.com/office/word/2012/wordml" xmlns:w16cex="http://schemas.microsoft.com/office/word/2018/wordml/cex" xmlns:w16cid="http://schemas.microsoft.com/office/word/2016/wordml/cid" xmlns:w16="http://schemas.microsoft.com/office/word/2018/wordml" xmlns:w16du="http://schemas.microsoft.com/office/word/2023/wordml/word16du" xmlns:w16sdtdh="http://schemas.microsoft.com/office/word/2020/wordml/sdtdatahash" xmlns:w16sdtfl="http://schemas.microsoft.com/office/word/2024/wordml/sdtformatlock" xmlns:w16se="http://schemas.microsoft.com/office/word/2015/wordml/symex" xmlns:wpg="http://schemas.microsoft.com/office/word/2010/wordprocessingGroup" xmlns:wpi="http://schemas.microsoft.com/office/word/2010/wordprocessingInk" xmlns:wne="http://schemas.microsoft.com/office/word/2006/wordml" xmlns:wps="http://schemas.microsoft.com/office/word/2010/wordprocessingShape" mc:Ignorable="w14 w15 w16se w16cid w16 w16cex w16sdtdh w16sdtfl w16du wp14">
   <w:p>
     <w:pPr>
       <w:pStyle w:val="Cabealho"/>
@@ -530,7 +559,7 @@
 </file>
 
 <file path=word/numbering.xml><?xml version="1.0" encoding="utf-8"?>
-<w:numbering xmlns:wpc="http://schemas.microsoft.com/office/word/2010/wordprocessingCanvas" xmlns:cx="http://schemas.microsoft.com/office/drawing/2014/chartex" xmlns:cx1="http://schemas.microsoft.com/office/drawing/2015/9/8/chartex" xmlns:cx2="http://schemas.microsoft.com/office/drawing/2015/10/21/chartex" xmlns:cx3="http://schemas.microsoft.com/office/drawing/2016/5/9/chartex" xmlns:cx4="http://schemas.microsoft.com/office/drawing/2016/5/10/chartex" xmlns:cx5="http://schemas.microsoft.com/office/drawing/2016/5/11/chartex" xmlns:cx6="http://schemas.microsoft.com/office/drawing/2016/5/12/chartex" xmlns:cx7="http://schemas.microsoft.com/office/drawing/2016/5/13/chartex" xmlns:cx8="http://schemas.microsoft.com/office/drawing/2016/5/14/chartex" xmlns:mc="http://schemas.openxmlformats.org/markup-compatibility/2006" xmlns:aink="http://schemas.microsoft.com/office/drawing/2016/ink" xmlns:am3d="http://schemas.microsoft.com/office/drawing/2017/model3d" xmlns:o="urn:schemas-microsoft-com:office:office" xmlns:r="http://schemas.openxmlformats.org/officeDocument/2006/relationships" xmlns:m="http://schemas.openxmlformats.org/officeDocument/2006/math" xmlns:v="urn:schemas-microsoft-com:vml" xmlns:wp14="http://schemas.microsoft.com/office/word/2010/wordprocessingDrawing" xmlns:wp="http://schemas.openxmlformats.org/drawingml/2006/wordprocessingDrawing" xmlns:w10="urn:schemas-microsoft-com:office:word" xmlns:w="http://schemas.openxmlformats.org/wordprocessingml/2006/main" xmlns:w14="http://schemas.microsoft.com/office/word/2010/wordml" xmlns:w15="http://schemas.microsoft.com/office/word/2012/wordml" xmlns:w16cid="http://schemas.microsoft.com/office/word/2016/wordml/cid" xmlns:w16se="http://schemas.microsoft.com/office/word/2015/wordml/symex" xmlns:wpg="http://schemas.microsoft.com/office/word/2010/wordprocessingGroup" xmlns:wpi="http://schemas.microsoft.com/office/word/2010/wordprocessingInk" xmlns:wne="http://schemas.microsoft.com/office/word/2006/wordml" xmlns:wps="http://schemas.microsoft.com/office/word/2010/wordprocessingShape" mc:Ignorable="w14 w15 w16se w16cid wp14">
+<w:numbering xmlns:wpc="http://schemas.microsoft.com/office/word/2010/wordprocessingCanvas" xmlns:cx="http://schemas.microsoft.com/office/drawing/2014/chartex" xmlns:cx1="http://schemas.microsoft.com/office/drawing/2015/9/8/chartex" xmlns:cx2="http://schemas.microsoft.com/office/drawing/2015/10/21/chartex" xmlns:cx3="http://schemas.microsoft.com/office/drawing/2016/5/9/chartex" xmlns:cx4="http://schemas.microsoft.com/office/drawing/2016/5/10/chartex" xmlns:cx5="http://schemas.microsoft.com/office/drawing/2016/5/11/chartex" xmlns:cx6="http://schemas.microsoft.com/office/drawing/2016/5/12/chartex" xmlns:cx7="http://schemas.microsoft.com/office/drawing/2016/5/13/chartex" xmlns:cx8="http://schemas.microsoft.com/office/drawing/2016/5/14/chartex" xmlns:mc="http://schemas.openxmlformats.org/markup-compatibility/2006" xmlns:aink="http://schemas.microsoft.com/office/drawing/2016/ink" xmlns:am3d="http://schemas.microsoft.com/office/drawing/2017/model3d" xmlns:o="urn:schemas-microsoft-com:office:office" xmlns:oel="http://schemas.microsoft.com/office/2019/extlst" xmlns:r="http://schemas.openxmlformats.org/officeDocument/2006/relationships" xmlns:m="http://schemas.openxmlformats.org/officeDocument/2006/math" xmlns:v="urn:schemas-microsoft-com:vml" xmlns:wp14="http://schemas.microsoft.com/office/word/2010/wordprocessingDrawing" xmlns:wp="http://schemas.openxmlformats.org/drawingml/2006/wordprocessingDrawing" xmlns:w10="urn:schemas-microsoft-com:office:word" xmlns:w="http://schemas.openxmlformats.org/wordprocessingml/2006/main" xmlns:w14="http://schemas.microsoft.com/office/word/2010/wordml" xmlns:w15="http://schemas.microsoft.com/office/word/2012/wordml" xmlns:w16cex="http://schemas.microsoft.com/office/word/2018/wordml/cex" xmlns:w16cid="http://schemas.microsoft.com/office/word/2016/wordml/cid" xmlns:w16="http://schemas.microsoft.com/office/word/2018/wordml" xmlns:w16du="http://schemas.microsoft.com/office/word/2023/wordml/word16du" xmlns:w16sdtdh="http://schemas.microsoft.com/office/word/2020/wordml/sdtdatahash" xmlns:w16sdtfl="http://schemas.microsoft.com/office/word/2024/wordml/sdtformatlock" xmlns:w16se="http://schemas.microsoft.com/office/word/2015/wordml/symex" xmlns:wpg="http://schemas.microsoft.com/office/word/2010/wordprocessingGroup" xmlns:wpi="http://schemas.microsoft.com/office/word/2010/wordprocessingInk" xmlns:wne="http://schemas.microsoft.com/office/word/2006/wordml" xmlns:wps="http://schemas.microsoft.com/office/word/2010/wordprocessingShape" mc:Ignorable="w14 w15 w16se w16cid w16 w16cex w16sdtdh w16sdtfl w16du wp14">
   <w:abstractNum w:abstractNumId="0" w15:restartNumberingAfterBreak="0">
     <w:nsid w:val="03A34271"/>
     <w:multiLevelType w:val="hybridMultilevel"/>
@@ -1412,35 +1441,35 @@
       </w:rPr>
     </w:lvl>
   </w:abstractNum>
-  <w:num w:numId="1">
+  <w:num w:numId="1" w16cid:durableId="647442136">
     <w:abstractNumId w:val="7"/>
   </w:num>
-  <w:num w:numId="2">
+  <w:num w:numId="2" w16cid:durableId="1231036813">
     <w:abstractNumId w:val="3"/>
   </w:num>
-  <w:num w:numId="3">
+  <w:num w:numId="3" w16cid:durableId="1910068921">
     <w:abstractNumId w:val="1"/>
   </w:num>
-  <w:num w:numId="4">
+  <w:num w:numId="4" w16cid:durableId="2133936250">
     <w:abstractNumId w:val="2"/>
   </w:num>
-  <w:num w:numId="5">
+  <w:num w:numId="5" w16cid:durableId="1482306116">
     <w:abstractNumId w:val="5"/>
   </w:num>
-  <w:num w:numId="6">
+  <w:num w:numId="6" w16cid:durableId="308872909">
     <w:abstractNumId w:val="0"/>
   </w:num>
-  <w:num w:numId="7">
+  <w:num w:numId="7" w16cid:durableId="1785882756">
     <w:abstractNumId w:val="4"/>
   </w:num>
-  <w:num w:numId="8">
+  <w:num w:numId="8" w16cid:durableId="155075966">
     <w:abstractNumId w:val="6"/>
   </w:num>
 </w:numbering>
 </file>
 
 <file path=word/styles.xml><?xml version="1.0" encoding="utf-8"?>
-<w:styles xmlns:mc="http://schemas.openxmlformats.org/markup-compatibility/2006" xmlns:r="http://schemas.openxmlformats.org/officeDocument/2006/relationships" xmlns:w="http://schemas.openxmlformats.org/wordprocessingml/2006/main" xmlns:w14="http://schemas.microsoft.com/office/word/2010/wordml" xmlns:w15="http://schemas.microsoft.com/office/word/2012/wordml" xmlns:w16cid="http://schemas.microsoft.com/office/word/2016/wordml/cid" xmlns:w16se="http://schemas.microsoft.com/office/word/2015/wordml/symex" mc:Ignorable="w14 w15 w16se w16cid">
+<w:styles xmlns:mc="http://schemas.openxmlformats.org/markup-compatibility/2006" xmlns:r="http://schemas.openxmlformats.org/officeDocument/2006/relationships" xmlns:w="http://schemas.openxmlformats.org/wordprocessingml/2006/main" xmlns:w14="http://schemas.microsoft.com/office/word/2010/wordml" xmlns:w15="http://schemas.microsoft.com/office/word/2012/wordml" xmlns:w16cex="http://schemas.microsoft.com/office/word/2018/wordml/cex" xmlns:w16cid="http://schemas.microsoft.com/office/word/2016/wordml/cid" xmlns:w16="http://schemas.microsoft.com/office/word/2018/wordml" xmlns:w16du="http://schemas.microsoft.com/office/word/2023/wordml/word16du" xmlns:w16sdtdh="http://schemas.microsoft.com/office/word/2020/wordml/sdtdatahash" xmlns:w16sdtfl="http://schemas.microsoft.com/office/word/2024/wordml/sdtformatlock" xmlns:w16se="http://schemas.microsoft.com/office/word/2015/wordml/symex" mc:Ignorable="w14 w15 w16se w16cid w16 w16cex w16sdtdh w16sdtfl w16du">
   <w:docDefaults>
     <w:rPrDefault>
       <w:rPr>
@@ -1456,7 +1485,7 @@
       </w:pPr>
     </w:pPrDefault>
   </w:docDefaults>
-  <w:latentStyles w:defLockedState="0" w:defUIPriority="99" w:defSemiHidden="0" w:defUnhideWhenUsed="0" w:defQFormat="0" w:count="375">
+  <w:latentStyles w:defLockedState="0" w:defUIPriority="99" w:defSemiHidden="0" w:defUnhideWhenUsed="0" w:defQFormat="0" w:count="376">
     <w:lsdException w:name="Normal" w:uiPriority="0" w:qFormat="1"/>
     <w:lsdException w:name="heading 1" w:uiPriority="9" w:qFormat="1"/>
     <w:lsdException w:name="heading 2" w:semiHidden="1" w:uiPriority="9" w:unhideWhenUsed="1" w:qFormat="1"/>
@@ -1832,6 +1861,7 @@
     <w:lsdException w:name="Smart Hyperlink" w:semiHidden="1" w:unhideWhenUsed="1"/>
     <w:lsdException w:name="Hashtag" w:semiHidden="1" w:unhideWhenUsed="1"/>
     <w:lsdException w:name="Unresolved Mention" w:semiHidden="1" w:unhideWhenUsed="1"/>
+    <w:lsdException w:name="Smart Link" w:semiHidden="1" w:unhideWhenUsed="1"/>
   </w:latentStyles>
   <w:style w:type="paragraph" w:default="1" w:styleId="Normal">
     <w:name w:val="Normal"/>
@@ -2377,11 +2407,12 @@
 </file>
 
 <file path=customXml/item1.xml><?xml version="1.0" encoding="utf-8"?>
-<p:properties xmlns:p="http://schemas.microsoft.com/office/2006/metadata/properties" xmlns:xsi="http://www.w3.org/2001/XMLSchema-instance" xmlns:pc="http://schemas.microsoft.com/office/infopath/2007/PartnerControls">
-  <documentManagement>
-    <_activity xmlns="73bd2b1f-886a-4f1d-b0bb-23f49d491aa9" xsi:nil="true"/>
-  </documentManagement>
-</p:properties>
+<?mso-contentType ?>
+<FormTemplates xmlns="http://schemas.microsoft.com/sharepoint/v3/contenttype/forms">
+  <Display>DocumentLibraryForm</Display>
+  <Edit>DocumentLibraryForm</Edit>
+  <New>DocumentLibraryForm</New>
+</FormTemplates>
 </file>
 
 <file path=customXml/item2.xml><?xml version="1.0" encoding="utf-8"?>
@@ -2614,12 +2645,11 @@
 </file>
 
 <file path=customXml/item3.xml><?xml version="1.0" encoding="utf-8"?>
-<?mso-contentType ?>
-<FormTemplates xmlns="http://schemas.microsoft.com/sharepoint/v3/contenttype/forms">
-  <Display>DocumentLibraryForm</Display>
-  <Edit>DocumentLibraryForm</Edit>
-  <New>DocumentLibraryForm</New>
-</FormTemplates>
+<p:properties xmlns:p="http://schemas.microsoft.com/office/2006/metadata/properties" xmlns:xsi="http://www.w3.org/2001/XMLSchema-instance" xmlns:pc="http://schemas.microsoft.com/office/infopath/2007/PartnerControls">
+  <documentManagement>
+    <_activity xmlns="73bd2b1f-886a-4f1d-b0bb-23f49d491aa9" xsi:nil="true"/>
+  </documentManagement>
+</p:properties>
 </file>
 
 <file path=customXml/item4.xml><?xml version="1.0" encoding="utf-8"?>
@@ -2627,18 +2657,9 @@
 </file>
 
 <file path=customXml/itemProps1.xml><?xml version="1.0" encoding="utf-8"?>
-<ds:datastoreItem xmlns:ds="http://schemas.openxmlformats.org/officeDocument/2006/customXml" ds:itemID="{10811A0B-354D-477E-AF27-C929DD9532C2}">
+<ds:datastoreItem xmlns:ds="http://schemas.openxmlformats.org/officeDocument/2006/customXml" ds:itemID="{0593B9FC-456C-46BA-ABE7-4E86A6CE6864}">
   <ds:schemaRefs>
-    <ds:schemaRef ds:uri="http://schemas.microsoft.com/office/2006/documentManagement/types"/>
-    <ds:schemaRef ds:uri="http://purl.org/dc/terms/"/>
-    <ds:schemaRef ds:uri="85818a3c-b8e7-4f75-b80a-610982c277d3"/>
-    <ds:schemaRef ds:uri="http://purl.org/dc/dcmitype/"/>
-    <ds:schemaRef ds:uri="http://schemas.microsoft.com/office/infopath/2007/PartnerControls"/>
-    <ds:schemaRef ds:uri="http://purl.org/dc/elements/1.1/"/>
-    <ds:schemaRef ds:uri="http://schemas.microsoft.com/office/2006/metadata/properties"/>
-    <ds:schemaRef ds:uri="73bd2b1f-886a-4f1d-b0bb-23f49d491aa9"/>
-    <ds:schemaRef ds:uri="http://schemas.openxmlformats.org/package/2006/metadata/core-properties"/>
-    <ds:schemaRef ds:uri="http://www.w3.org/XML/1998/namespace"/>
+    <ds:schemaRef ds:uri="http://schemas.microsoft.com/sharepoint/v3/contenttype/forms"/>
   </ds:schemaRefs>
 </ds:datastoreItem>
 </file>
@@ -2663,9 +2684,11 @@
 </file>
 
 <file path=customXml/itemProps3.xml><?xml version="1.0" encoding="utf-8"?>
-<ds:datastoreItem xmlns:ds="http://schemas.openxmlformats.org/officeDocument/2006/customXml" ds:itemID="{0593B9FC-456C-46BA-ABE7-4E86A6CE6864}">
+<ds:datastoreItem xmlns:ds="http://schemas.openxmlformats.org/officeDocument/2006/customXml" ds:itemID="{10811A0B-354D-477E-AF27-C929DD9532C2}">
   <ds:schemaRefs>
-    <ds:schemaRef ds:uri="http://schemas.microsoft.com/sharepoint/v3/contenttype/forms"/>
+    <ds:schemaRef ds:uri="http://schemas.microsoft.com/office/2006/metadata/properties"/>
+    <ds:schemaRef ds:uri="http://schemas.microsoft.com/office/infopath/2007/PartnerControls"/>
+    <ds:schemaRef ds:uri="73bd2b1f-886a-4f1d-b0bb-23f49d491aa9"/>
   </ds:schemaRefs>
 </ds:datastoreItem>
 </file>

</xml_diff>